<commit_message>
docs: record the real repository URL, the CI run and the SCA catch
- report cover: repository / pipeline / run id (794 -> real links)
- CI section: per-gate results plus the 18-advisory table from the first build
- README: replace the screenshot placeholders with the captured evidence
- SHOTLIST: mark the CI images as captured, explain what they are
</commit_message>
<xml_diff>
--- a/docs/Work1-Report.docx
+++ b/docs/Work1-Report.docx
@@ -267,11 +267,10 @@
           <w:p>
             <w:r>
               <w:rPr>
-                <w:rFonts w:ascii="Calibri" w:hAnsi="Calibri" w:eastAsia="Consolas"/>
-                <w:color w:val="9C272E"/>
+                <w:rFonts w:ascii="Calibri" w:hAnsi="Calibri"/>
                 <w:sz w:val="21"/>
               </w:rPr>
-              <w:t>https://github.com/&lt;user&gt;/secure-demo-api</w:t>
+              <w:t>&lt;https://github.com/foreverlanterns/secure-demo-api&gt;</w:t>
             </w:r>
           </w:p>
         </w:tc>
@@ -314,11 +313,71 @@
           <w:p>
             <w:r>
               <w:rPr>
+                <w:rFonts w:ascii="Calibri" w:hAnsi="Calibri"/>
+                <w:sz w:val="21"/>
+              </w:rPr>
+              <w:t>&lt;https://github.com/foreverlanterns/secure-demo-api/actions&gt;</w:t>
+            </w:r>
+          </w:p>
+        </w:tc>
+      </w:tr>
+      <w:tr>
+        <w:tc>
+          <w:tcPr>
+            <w:tcW w:type="dxa" w:w="2608"/>
+            <w:tcBorders>
+              <w:top w:val="nil"/>
+              <w:left w:val="nil"/>
+              <w:bottom w:val="nil"/>
+              <w:right w:val="nil"/>
+            </w:tcBorders>
+          </w:tcPr>
+          <w:p>
+            <w:pPr>
+              <w:jc w:val="right"/>
+            </w:pPr>
+            <w:r>
+              <w:rPr>
+                <w:b/>
+                <w:color w:val="595959"/>
+                <w:sz w:val="21"/>
+              </w:rPr>
+              <w:t xml:space="preserve">Last successful run </w:t>
+            </w:r>
+          </w:p>
+        </w:tc>
+        <w:tc>
+          <w:tcPr>
+            <w:tcW w:type="dxa" w:w="5783"/>
+            <w:tcBorders>
+              <w:top w:val="nil"/>
+              <w:left w:val="nil"/>
+              <w:bottom w:val="nil"/>
+              <w:right w:val="nil"/>
+            </w:tcBorders>
+          </w:tcPr>
+          <w:p>
+            <w:r>
+              <w:rPr>
+                <w:rFonts w:ascii="Calibri" w:hAnsi="Calibri"/>
+                <w:sz w:val="21"/>
+              </w:rPr>
+              <w:t xml:space="preserve">39460231575 — </w:t>
+            </w:r>
+            <w:r>
+              <w:rPr>
                 <w:rFonts w:ascii="Calibri" w:hAnsi="Calibri" w:eastAsia="Consolas"/>
                 <w:color w:val="9C272E"/>
                 <w:sz w:val="21"/>
               </w:rPr>
-              <w:t>https://github.com/&lt;user&gt;/secure-demo-api/actions</w:t>
+              <w:t>ef4a7fb</w:t>
+            </w:r>
+            <w:r>
+              <w:rPr>
+                <w:rFonts w:ascii="Calibri" w:hAnsi="Calibri"/>
+                <w:sz w:val="21"/>
+              </w:rPr>
+              <w:t>, all three jobs green</w:t>
             </w:r>
           </w:p>
         </w:tc>
@@ -341,7 +400,7 @@
           <w:color w:val="595959"/>
           <w:sz w:val="19"/>
         </w:rPr>
-        <w:t>Fill the four placeholders above before submitting. Everything else in this</w:t>
+        <w:t>Fill the three placeholders above (variant, student, HDU number) before</w:t>
       </w:r>
     </w:p>
     <w:p>
@@ -356,7 +415,22 @@
           <w:color w:val="595959"/>
           <w:sz w:val="19"/>
         </w:rPr>
-        <w:t>document reflects the code in the repository.</w:t>
+        <w:t>submitting. Everything else — including the repository and the pipeline run —</w:t>
+      </w:r>
+    </w:p>
+    <w:p>
+      <w:pPr>
+        <w:spacing w:after="120"/>
+        <w:ind w:left="283"/>
+        <w:shd w:val="clear" w:color="auto" w:fill="F7F7F2"/>
+      </w:pPr>
+      <w:r>
+        <w:rPr>
+          <w:rFonts w:ascii="Calibri" w:hAnsi="Calibri"/>
+          <w:color w:val="595959"/>
+          <w:sz w:val="19"/>
+        </w:rPr>
+        <w:t>is real.</w:t>
       </w:r>
     </w:p>
     <w:p>
@@ -2474,14 +2548,15 @@
         <w:tblLook w:firstColumn="1" w:firstRow="1" w:lastColumn="0" w:lastRow="0" w:noHBand="0" w:noVBand="1" w:val="04A0"/>
       </w:tblPr>
       <w:tblGrid>
-        <w:gridCol w:w="3099"/>
-        <w:gridCol w:w="3099"/>
-        <w:gridCol w:w="3099"/>
+        <w:gridCol w:w="2324"/>
+        <w:gridCol w:w="2324"/>
+        <w:gridCol w:w="2324"/>
+        <w:gridCol w:w="2324"/>
       </w:tblGrid>
       <w:tr>
         <w:tc>
           <w:tcPr>
-            <w:tcW w:type="dxa" w:w="3099"/>
+            <w:tcW w:type="dxa" w:w="2324"/>
             <w:shd w:val="clear" w:color="auto" w:fill="E8EEF7"/>
           </w:tcPr>
           <w:p>
@@ -2500,7 +2575,7 @@
         </w:tc>
         <w:tc>
           <w:tcPr>
-            <w:tcW w:type="dxa" w:w="3099"/>
+            <w:tcW w:type="dxa" w:w="2324"/>
             <w:shd w:val="clear" w:color="auto" w:fill="E8EEF7"/>
           </w:tcPr>
           <w:p>
@@ -2519,7 +2594,7 @@
         </w:tc>
         <w:tc>
           <w:tcPr>
-            <w:tcW w:type="dxa" w:w="3099"/>
+            <w:tcW w:type="dxa" w:w="2324"/>
             <w:shd w:val="clear" w:color="auto" w:fill="E8EEF7"/>
           </w:tcPr>
           <w:p>
@@ -2536,11 +2611,39 @@
             </w:r>
           </w:p>
         </w:tc>
+        <w:tc>
+          <w:tcPr>
+            <w:tcW w:type="dxa" w:w="2324"/>
+            <w:shd w:val="clear" w:color="auto" w:fill="E8EEF7"/>
+          </w:tcPr>
+          <w:p>
+            <w:pPr>
+              <w:spacing w:after="40" w:before="40"/>
+            </w:pPr>
+            <w:r>
+              <w:rPr>
+                <w:rFonts w:ascii="Calibri" w:hAnsi="Calibri"/>
+                <w:b/>
+                <w:sz w:val="18"/>
+              </w:rPr>
+              <w:t xml:space="preserve">Result on </w:t>
+            </w:r>
+            <w:r>
+              <w:rPr>
+                <w:rFonts w:ascii="Calibri" w:hAnsi="Calibri" w:eastAsia="Consolas"/>
+                <w:b/>
+                <w:color w:val="9C272E"/>
+                <w:sz w:val="18"/>
+              </w:rPr>
+              <w:t>ef4a7fb</w:t>
+            </w:r>
+          </w:p>
+        </w:tc>
       </w:tr>
       <w:tr>
         <w:tc>
           <w:tcPr>
-            <w:tcW w:type="dxa" w:w="3099"/>
+            <w:tcW w:type="dxa" w:w="2324"/>
           </w:tcPr>
           <w:p>
             <w:pPr>
@@ -2558,7 +2661,7 @@
         </w:tc>
         <w:tc>
           <w:tcPr>
-            <w:tcW w:type="dxa" w:w="3099"/>
+            <w:tcW w:type="dxa" w:w="2324"/>
           </w:tcPr>
           <w:p>
             <w:pPr>
@@ -2575,7 +2678,7 @@
         </w:tc>
         <w:tc>
           <w:tcPr>
-            <w:tcW w:type="dxa" w:w="3099"/>
+            <w:tcW w:type="dxa" w:w="2324"/>
           </w:tcPr>
           <w:p>
             <w:pPr>
@@ -2590,11 +2693,28 @@
             </w:r>
           </w:p>
         </w:tc>
+        <w:tc>
+          <w:tcPr>
+            <w:tcW w:type="dxa" w:w="2324"/>
+          </w:tcPr>
+          <w:p>
+            <w:pPr>
+              <w:spacing w:after="40" w:before="40"/>
+            </w:pPr>
+            <w:r>
+              <w:rPr>
+                <w:rFonts w:ascii="Calibri" w:hAnsi="Calibri"/>
+                <w:sz w:val="18"/>
+              </w:rPr>
+              <w:t>22 passed</w:t>
+            </w:r>
+          </w:p>
+        </w:tc>
       </w:tr>
       <w:tr>
         <w:tc>
           <w:tcPr>
-            <w:tcW w:type="dxa" w:w="3099"/>
+            <w:tcW w:type="dxa" w:w="2324"/>
           </w:tcPr>
           <w:p>
             <w:pPr>
@@ -2612,7 +2732,7 @@
         </w:tc>
         <w:tc>
           <w:tcPr>
-            <w:tcW w:type="dxa" w:w="3099"/>
+            <w:tcW w:type="dxa" w:w="2324"/>
           </w:tcPr>
           <w:p>
             <w:pPr>
@@ -2637,7 +2757,7 @@
         </w:tc>
         <w:tc>
           <w:tcPr>
-            <w:tcW w:type="dxa" w:w="3099"/>
+            <w:tcW w:type="dxa" w:w="2324"/>
           </w:tcPr>
           <w:p>
             <w:pPr>
@@ -2648,7 +2768,24 @@
                 <w:rFonts w:ascii="Calibri" w:hAnsi="Calibri"/>
                 <w:sz w:val="18"/>
               </w:rPr>
-              <w:t>fails on MEDIUM or higher; SARIF uploaded to code scanning</w:t>
+              <w:t>fails on MEDIUM or higher; SARIF to code scanning</w:t>
+            </w:r>
+          </w:p>
+        </w:tc>
+        <w:tc>
+          <w:tcPr>
+            <w:tcW w:type="dxa" w:w="2324"/>
+          </w:tcPr>
+          <w:p>
+            <w:pPr>
+              <w:spacing w:after="40" w:before="40"/>
+            </w:pPr>
+            <w:r>
+              <w:rPr>
+                <w:rFonts w:ascii="Calibri" w:hAnsi="Calibri"/>
+                <w:sz w:val="18"/>
+              </w:rPr>
+              <w:t>no issues at MEDIUM+, one Low below the gate</w:t>
             </w:r>
           </w:p>
         </w:tc>
@@ -2656,7 +2793,7 @@
       <w:tr>
         <w:tc>
           <w:tcPr>
-            <w:tcW w:type="dxa" w:w="3099"/>
+            <w:tcW w:type="dxa" w:w="2324"/>
           </w:tcPr>
           <w:p>
             <w:pPr>
@@ -2674,7 +2811,7 @@
         </w:tc>
         <w:tc>
           <w:tcPr>
-            <w:tcW w:type="dxa" w:w="3099"/>
+            <w:tcW w:type="dxa" w:w="2324"/>
           </w:tcPr>
           <w:p>
             <w:pPr>
@@ -2699,7 +2836,7 @@
         </w:tc>
         <w:tc>
           <w:tcPr>
-            <w:tcW w:type="dxa" w:w="3099"/>
+            <w:tcW w:type="dxa" w:w="2324"/>
           </w:tcPr>
           <w:p>
             <w:pPr>
@@ -2714,6 +2851,23 @@
             </w:r>
           </w:p>
         </w:tc>
+        <w:tc>
+          <w:tcPr>
+            <w:tcW w:type="dxa" w:w="2324"/>
+          </w:tcPr>
+          <w:p>
+            <w:pPr>
+              <w:spacing w:after="40" w:before="40"/>
+            </w:pPr>
+            <w:r>
+              <w:rPr>
+                <w:rFonts w:ascii="Calibri" w:hAnsi="Calibri"/>
+                <w:sz w:val="18"/>
+              </w:rPr>
+              <w:t>no known vulnerabilities</w:t>
+            </w:r>
+          </w:p>
+        </w:tc>
       </w:tr>
     </w:tbl>
     <w:p>
@@ -2782,9 +2936,26 @@
       <w:r>
         <w:rPr>
           <w:rFonts w:ascii="Calibri" w:hAnsi="Calibri"/>
+          <w:b/>
           <w:sz w:val="21"/>
         </w:rPr>
-        <w:t xml:space="preserve">Evidence: </w:t>
+        <w:t>The pipeline caught a real defect on its first run.</w:t>
+      </w:r>
+      <w:r>
+        <w:rPr>
+          <w:rFonts w:ascii="Calibri" w:hAnsi="Calibri"/>
+          <w:sz w:val="21"/>
+        </w:rPr>
+        <w:t xml:space="preserve"> The initial build failed —</w:t>
+      </w:r>
+    </w:p>
+    <w:p>
+      <w:r>
+        <w:rPr>
+          <w:rFonts w:ascii="Calibri" w:hAnsi="Calibri"/>
+          <w:sz w:val="21"/>
+        </w:rPr>
+        <w:t xml:space="preserve">not on the tests, but on SCA. </w:t>
       </w:r>
       <w:r>
         <w:rPr>
@@ -2792,7 +2963,280 @@
           <w:color w:val="9C272E"/>
           <w:sz w:val="21"/>
         </w:rPr>
-        <w:t>docs/screenshots/01-ci-green.png</w:t>
+        <w:t>pip-audit</w:t>
+      </w:r>
+      <w:r>
+        <w:rPr>
+          <w:rFonts w:ascii="Calibri" w:hAnsi="Calibri"/>
+          <w:sz w:val="21"/>
+        </w:rPr>
+        <w:t xml:space="preserve"> reported 18 advisories across the two</w:t>
+      </w:r>
+    </w:p>
+    <w:p>
+      <w:r>
+        <w:rPr>
+          <w:rFonts w:ascii="Calibri" w:hAnsi="Calibri"/>
+          <w:sz w:val="21"/>
+        </w:rPr>
+        <w:t>pinned dependencies:</w:t>
+      </w:r>
+    </w:p>
+    <w:tbl>
+      <w:tblPr>
+        <w:tblStyle w:val="TableGrid"/>
+        <w:tblW w:type="auto" w:w="0"/>
+        <w:jc w:val="center"/>
+        <w:tblLayout w:type="autofit"/>
+        <w:tblLook w:firstColumn="1" w:firstRow="1" w:lastColumn="0" w:lastRow="0" w:noHBand="0" w:noVBand="1" w:val="04A0"/>
+      </w:tblPr>
+      <w:tblGrid>
+        <w:gridCol w:w="2324"/>
+        <w:gridCol w:w="2324"/>
+        <w:gridCol w:w="2324"/>
+        <w:gridCol w:w="2324"/>
+      </w:tblGrid>
+      <w:tr>
+        <w:tc>
+          <w:tcPr>
+            <w:tcW w:type="dxa" w:w="2324"/>
+            <w:shd w:val="clear" w:color="auto" w:fill="E8EEF7"/>
+          </w:tcPr>
+          <w:p>
+            <w:pPr>
+              <w:spacing w:after="40" w:before="40"/>
+            </w:pPr>
+            <w:r>
+              <w:rPr>
+                <w:rFonts w:ascii="Calibri" w:hAnsi="Calibri"/>
+                <w:b/>
+                <w:sz w:val="18"/>
+              </w:rPr>
+              <w:t>Package</w:t>
+            </w:r>
+          </w:p>
+        </w:tc>
+        <w:tc>
+          <w:tcPr>
+            <w:tcW w:type="dxa" w:w="2324"/>
+            <w:shd w:val="clear" w:color="auto" w:fill="E8EEF7"/>
+          </w:tcPr>
+          <w:p>
+            <w:pPr>
+              <w:spacing w:after="40" w:before="40"/>
+            </w:pPr>
+            <w:r>
+              <w:rPr>
+                <w:rFonts w:ascii="Calibri" w:hAnsi="Calibri"/>
+                <w:b/>
+                <w:sz w:val="18"/>
+              </w:rPr>
+              <w:t>Version</w:t>
+            </w:r>
+          </w:p>
+        </w:tc>
+        <w:tc>
+          <w:tcPr>
+            <w:tcW w:type="dxa" w:w="2324"/>
+            <w:shd w:val="clear" w:color="auto" w:fill="E8EEF7"/>
+          </w:tcPr>
+          <w:p>
+            <w:pPr>
+              <w:spacing w:after="40" w:before="40"/>
+            </w:pPr>
+            <w:r>
+              <w:rPr>
+                <w:rFonts w:ascii="Calibri" w:hAnsi="Calibri"/>
+                <w:b/>
+                <w:sz w:val="18"/>
+              </w:rPr>
+              <w:t>Advisories</w:t>
+            </w:r>
+          </w:p>
+        </w:tc>
+        <w:tc>
+          <w:tcPr>
+            <w:tcW w:type="dxa" w:w="2324"/>
+            <w:shd w:val="clear" w:color="auto" w:fill="E8EEF7"/>
+          </w:tcPr>
+          <w:p>
+            <w:pPr>
+              <w:spacing w:after="40" w:before="40"/>
+            </w:pPr>
+            <w:r>
+              <w:rPr>
+                <w:rFonts w:ascii="Calibri" w:hAnsi="Calibri"/>
+                <w:b/>
+                <w:sz w:val="18"/>
+              </w:rPr>
+              <w:t>Fixed in</w:t>
+            </w:r>
+          </w:p>
+        </w:tc>
+      </w:tr>
+      <w:tr>
+        <w:tc>
+          <w:tcPr>
+            <w:tcW w:type="dxa" w:w="2324"/>
+          </w:tcPr>
+          <w:p>
+            <w:pPr>
+              <w:spacing w:after="40" w:before="40"/>
+            </w:pPr>
+            <w:r>
+              <w:rPr>
+                <w:rFonts w:ascii="Calibri" w:hAnsi="Calibri" w:eastAsia="Consolas"/>
+                <w:color w:val="9C272E"/>
+                <w:sz w:val="18"/>
+              </w:rPr>
+              <w:t>flask</w:t>
+            </w:r>
+          </w:p>
+        </w:tc>
+        <w:tc>
+          <w:tcPr>
+            <w:tcW w:type="dxa" w:w="2324"/>
+          </w:tcPr>
+          <w:p>
+            <w:pPr>
+              <w:spacing w:after="40" w:before="40"/>
+            </w:pPr>
+            <w:r>
+              <w:rPr>
+                <w:rFonts w:ascii="Calibri" w:hAnsi="Calibri"/>
+                <w:sz w:val="18"/>
+              </w:rPr>
+              <w:t>3.1.0</w:t>
+            </w:r>
+          </w:p>
+        </w:tc>
+        <w:tc>
+          <w:tcPr>
+            <w:tcW w:type="dxa" w:w="2324"/>
+          </w:tcPr>
+          <w:p>
+            <w:pPr>
+              <w:spacing w:after="40" w:before="40"/>
+            </w:pPr>
+            <w:r>
+              <w:rPr>
+                <w:rFonts w:ascii="Calibri" w:hAnsi="Calibri"/>
+                <w:sz w:val="18"/>
+              </w:rPr>
+              <w:t>PYSEC-2026-1377, PYSEC-2026-2151</w:t>
+            </w:r>
+          </w:p>
+        </w:tc>
+        <w:tc>
+          <w:tcPr>
+            <w:tcW w:type="dxa" w:w="2324"/>
+          </w:tcPr>
+          <w:p>
+            <w:pPr>
+              <w:spacing w:after="40" w:before="40"/>
+            </w:pPr>
+            <w:r>
+              <w:rPr>
+                <w:rFonts w:ascii="Calibri" w:hAnsi="Calibri"/>
+                <w:sz w:val="18"/>
+              </w:rPr>
+              <w:t>3.1.1 / 3.1.3</w:t>
+            </w:r>
+          </w:p>
+        </w:tc>
+      </w:tr>
+      <w:tr>
+        <w:tc>
+          <w:tcPr>
+            <w:tcW w:type="dxa" w:w="2324"/>
+          </w:tcPr>
+          <w:p>
+            <w:pPr>
+              <w:spacing w:after="40" w:before="40"/>
+            </w:pPr>
+            <w:r>
+              <w:rPr>
+                <w:rFonts w:ascii="Calibri" w:hAnsi="Calibri" w:eastAsia="Consolas"/>
+                <w:color w:val="9C272E"/>
+                <w:sz w:val="18"/>
+              </w:rPr>
+              <w:t>pyjwt</w:t>
+            </w:r>
+          </w:p>
+        </w:tc>
+        <w:tc>
+          <w:tcPr>
+            <w:tcW w:type="dxa" w:w="2324"/>
+          </w:tcPr>
+          <w:p>
+            <w:pPr>
+              <w:spacing w:after="40" w:before="40"/>
+            </w:pPr>
+            <w:r>
+              <w:rPr>
+                <w:rFonts w:ascii="Calibri" w:hAnsi="Calibri"/>
+                <w:sz w:val="18"/>
+              </w:rPr>
+              <w:t>2.10.1</w:t>
+            </w:r>
+          </w:p>
+        </w:tc>
+        <w:tc>
+          <w:tcPr>
+            <w:tcW w:type="dxa" w:w="2324"/>
+          </w:tcPr>
+          <w:p>
+            <w:pPr>
+              <w:spacing w:after="40" w:before="40"/>
+            </w:pPr>
+            <w:r>
+              <w:rPr>
+                <w:rFonts w:ascii="Calibri" w:hAnsi="Calibri"/>
+                <w:sz w:val="18"/>
+              </w:rPr>
+              <w:t>PYSEC-2025-183, PYSEC-2026-120/175–179/4140–4149/4152/4183</w:t>
+            </w:r>
+          </w:p>
+        </w:tc>
+        <w:tc>
+          <w:tcPr>
+            <w:tcW w:type="dxa" w:w="2324"/>
+          </w:tcPr>
+          <w:p>
+            <w:pPr>
+              <w:spacing w:after="40" w:before="40"/>
+            </w:pPr>
+            <w:r>
+              <w:rPr>
+                <w:rFonts w:ascii="Calibri" w:hAnsi="Calibri"/>
+                <w:sz w:val="18"/>
+              </w:rPr>
+              <w:t>2.12.0 – 2.15.0</w:t>
+            </w:r>
+          </w:p>
+        </w:tc>
+      </w:tr>
+    </w:tbl>
+    <w:p>
+      <w:pPr>
+        <w:spacing w:after="40"/>
+      </w:pPr>
+    </w:p>
+    <w:p>
+      <w:r>
+        <w:rPr>
+          <w:rFonts w:ascii="Calibri" w:hAnsi="Calibri"/>
+          <w:sz w:val="21"/>
+        </w:rPr>
+        <w:t xml:space="preserve">The pins were raised to </w:t>
+      </w:r>
+      <w:r>
+        <w:rPr>
+          <w:rFonts w:ascii="Calibri" w:hAnsi="Calibri" w:eastAsia="Consolas"/>
+          <w:color w:val="9C272E"/>
+          <w:sz w:val="21"/>
+        </w:rPr>
+        <w:t>Flask==3.1.3</w:t>
       </w:r>
       <w:r>
         <w:rPr>
@@ -2807,14 +3251,118 @@
           <w:color w:val="9C272E"/>
           <w:sz w:val="21"/>
         </w:rPr>
-        <w:t>02-sast-sca.png</w:t>
+        <w:t>PyJWT==2.15.1</w:t>
       </w:r>
       <w:r>
         <w:rPr>
           <w:rFonts w:ascii="Calibri" w:hAnsi="Calibri"/>
           <w:sz w:val="21"/>
         </w:rPr>
-        <w:t>.</w:t>
+        <w:t xml:space="preserve">, </w:t>
+      </w:r>
+      <w:r>
+        <w:rPr>
+          <w:rFonts w:ascii="Calibri" w:hAnsi="Calibri" w:eastAsia="Consolas"/>
+          <w:color w:val="9C272E"/>
+          <w:sz w:val="21"/>
+        </w:rPr>
+        <w:t>bcrypt==5.0.0</w:t>
+      </w:r>
+      <w:r>
+        <w:rPr>
+          <w:rFonts w:ascii="Calibri" w:hAnsi="Calibri"/>
+          <w:sz w:val="21"/>
+        </w:rPr>
+        <w:t>; the suite</w:t>
+      </w:r>
+    </w:p>
+    <w:p>
+      <w:r>
+        <w:rPr>
+          <w:rFonts w:ascii="Calibri" w:hAnsi="Calibri"/>
+          <w:sz w:val="21"/>
+        </w:rPr>
+        <w:t xml:space="preserve">still passed and the next run went green (run 39460231575, commit </w:t>
+      </w:r>
+      <w:r>
+        <w:rPr>
+          <w:rFonts w:ascii="Calibri" w:hAnsi="Calibri" w:eastAsia="Consolas"/>
+          <w:color w:val="9C272E"/>
+          <w:sz w:val="21"/>
+        </w:rPr>
+        <w:t>ef4a7fb</w:t>
+      </w:r>
+      <w:r>
+        <w:rPr>
+          <w:rFonts w:ascii="Calibri" w:hAnsi="Calibri"/>
+          <w:sz w:val="21"/>
+        </w:rPr>
+        <w:t>). A</w:t>
+      </w:r>
+    </w:p>
+    <w:p>
+      <w:r>
+        <w:rPr>
+          <w:rFonts w:ascii="Calibri" w:hAnsi="Calibri"/>
+          <w:sz w:val="21"/>
+        </w:rPr>
+        <w:t>reviewer would not have noticed a stale pin by reading the diff — the gate did.</w:t>
+      </w:r>
+    </w:p>
+    <w:p>
+      <w:r>
+        <w:rPr>
+          <w:rFonts w:ascii="Calibri" w:hAnsi="Calibri"/>
+          <w:sz w:val="21"/>
+        </w:rPr>
+        <w:t xml:space="preserve">Evidence: </w:t>
+      </w:r>
+      <w:r>
+        <w:rPr>
+          <w:rFonts w:ascii="Calibri" w:hAnsi="Calibri" w:eastAsia="Consolas"/>
+          <w:color w:val="9C272E"/>
+          <w:sz w:val="21"/>
+        </w:rPr>
+        <w:t>docs/screenshots/02-ci-green.png</w:t>
+      </w:r>
+      <w:r>
+        <w:rPr>
+          <w:rFonts w:ascii="Calibri" w:hAnsi="Calibri"/>
+          <w:sz w:val="21"/>
+        </w:rPr>
+        <w:t xml:space="preserve"> (three jobs green),</w:t>
+      </w:r>
+    </w:p>
+    <w:p>
+      <w:r>
+        <w:rPr>
+          <w:rFonts w:ascii="Calibri" w:hAnsi="Calibri" w:eastAsia="Consolas"/>
+          <w:color w:val="9C272E"/>
+          <w:sz w:val="21"/>
+        </w:rPr>
+        <w:t>02b-ci-logs.png</w:t>
+      </w:r>
+      <w:r>
+        <w:rPr>
+          <w:rFonts w:ascii="Calibri" w:hAnsi="Calibri"/>
+          <w:sz w:val="21"/>
+        </w:rPr>
+        <w:t xml:space="preserve"> (the three gates' output), </w:t>
+      </w:r>
+      <w:r>
+        <w:rPr>
+          <w:rFonts w:ascii="Calibri" w:hAnsi="Calibri" w:eastAsia="Consolas"/>
+          <w:color w:val="9C272E"/>
+          <w:sz w:val="21"/>
+        </w:rPr>
+        <w:t>02c-sca-caught.png</w:t>
+      </w:r>
+      <w:r>
+        <w:rPr>
+          <w:rFonts w:ascii="Calibri" w:hAnsi="Calibri"/>
+          <w:sz w:val="21"/>
+        </w:rPr>
+        <w:t xml:space="preserve"> (the rejection).</w:t>
       </w:r>
     </w:p>
     <w:p>

</xml_diff>

<commit_message>
docs: use the real Actions screenshots; record the SARIF fix
- 4 screen captures from the Actions UI (run list, the failed first run,
  a green run, and the annotation that exposed the SARIF bug)
- report embeds the failure and the green run; README tells both stories
- SHOTLIST rewritten around the real files
</commit_message>
<xml_diff>
--- a/docs/Work1-Report.docx
+++ b/docs/Work1-Report.docx
@@ -362,7 +362,7 @@
                 <w:rFonts w:ascii="Calibri" w:hAnsi="Calibri"/>
                 <w:sz w:val="21"/>
               </w:rPr>
-              <w:t xml:space="preserve">39460231575 — </w:t>
+              <w:t xml:space="preserve">39467212818 — </w:t>
             </w:r>
             <w:r>
               <w:rPr>
@@ -370,14 +370,14 @@
                 <w:color w:val="9C272E"/>
                 <w:sz w:val="21"/>
               </w:rPr>
-              <w:t>ef4a7fb</w:t>
+              <w:t>bd09fb1</w:t>
             </w:r>
             <w:r>
               <w:rPr>
                 <w:rFonts w:ascii="Calibri" w:hAnsi="Calibri"/>
                 <w:sz w:val="21"/>
               </w:rPr>
-              <w:t>, all three jobs green</w:t>
+              <w:t>, all three jobs green, SARIF in Code scanning</w:t>
             </w:r>
           </w:p>
         </w:tc>
@@ -2635,7 +2635,7 @@
                 <w:color w:val="9C272E"/>
                 <w:sz w:val="18"/>
               </w:rPr>
-              <w:t>ef4a7fb</w:t>
+              <w:t>bd09fb1</w:t>
             </w:r>
           </w:p>
         </w:tc>
@@ -2672,7 +2672,7 @@
                 <w:rFonts w:ascii="Calibri" w:hAnsi="Calibri"/>
                 <w:sz w:val="18"/>
               </w:rPr>
-              <w:t>pytest</w:t>
+              <w:t>pytest 8.3.4</w:t>
             </w:r>
           </w:p>
         </w:tc>
@@ -2743,7 +2743,7 @@
                 <w:rFonts w:ascii="Calibri" w:hAnsi="Calibri"/>
                 <w:sz w:val="18"/>
               </w:rPr>
-              <w:t xml:space="preserve">bandit </w:t>
+              <w:t xml:space="preserve">bandit 1.9.4 </w:t>
             </w:r>
             <w:r>
               <w:rPr>
@@ -2822,7 +2822,7 @@
                 <w:rFonts w:ascii="Calibri" w:hAnsi="Calibri"/>
                 <w:sz w:val="18"/>
               </w:rPr>
-              <w:t xml:space="preserve">pip-audit </w:t>
+              <w:t xml:space="preserve">pip-audit 2.7.3 </w:t>
             </w:r>
             <w:r>
               <w:rPr>
@@ -3223,6 +3223,58 @@
       </w:pPr>
     </w:p>
     <w:p>
+      <w:pPr>
+        <w:jc w:val="center"/>
+      </w:pPr>
+      <w:r>
+        <w:drawing>
+          <wp:inline xmlns:a="http://schemas.openxmlformats.org/drawingml/2006/main" xmlns:pic="http://schemas.openxmlformats.org/drawingml/2006/picture">
+            <wp:extent cx="5832000" cy="3346110"/>
+            <wp:docPr id="1" name="Picture 1"/>
+            <wp:cNvGraphicFramePr>
+              <a:graphicFrameLocks noChangeAspect="1"/>
+            </wp:cNvGraphicFramePr>
+            <a:graphic>
+              <a:graphicData uri="http://schemas.openxmlformats.org/drawingml/2006/picture">
+                <pic:pic>
+                  <pic:nvPicPr>
+                    <pic:cNvPr id="0" name="01b-run1-failed.png"/>
+                    <pic:cNvPicPr/>
+                  </pic:nvPicPr>
+                  <pic:blipFill>
+                    <a:blip r:embed="rId10"/>
+                    <a:stretch>
+                      <a:fillRect/>
+                    </a:stretch>
+                  </pic:blipFill>
+                  <pic:spPr>
+                    <a:xfrm>
+                      <a:off x="0" y="0"/>
+                      <a:ext cx="5832000" cy="3346110"/>
+                    </a:xfrm>
+                    <a:prstGeom prst="rect"/>
+                  </pic:spPr>
+                </pic:pic>
+              </a:graphicData>
+            </a:graphic>
+          </wp:inline>
+        </w:drawing>
+      </w:r>
+    </w:p>
+    <w:p>
+      <w:pPr>
+        <w:jc w:val="center"/>
+      </w:pPr>
+      <w:r>
+        <w:rPr>
+          <w:i/>
+          <w:color w:val="595959"/>
+          <w:sz w:val="17"/>
+        </w:rPr>
+        <w:t>run 1 — the SCA gate fails the build</w:t>
+      </w:r>
+    </w:p>
+    <w:p>
       <w:r>
         <w:rPr>
           <w:rFonts w:ascii="Calibri" w:hAnsi="Calibri"/>
@@ -3310,12 +3362,81 @@
       </w:r>
     </w:p>
     <w:p>
+      <w:pPr>
+        <w:jc w:val="center"/>
+      </w:pPr>
+      <w:r>
+        <w:drawing>
+          <wp:inline xmlns:a="http://schemas.openxmlformats.org/drawingml/2006/main" xmlns:pic="http://schemas.openxmlformats.org/drawingml/2006/picture">
+            <wp:extent cx="5832000" cy="3331530"/>
+            <wp:docPr id="2" name="Picture 2"/>
+            <wp:cNvGraphicFramePr>
+              <a:graphicFrameLocks noChangeAspect="1"/>
+            </wp:cNvGraphicFramePr>
+            <a:graphic>
+              <a:graphicData uri="http://schemas.openxmlformats.org/drawingml/2006/picture">
+                <pic:pic>
+                  <pic:nvPicPr>
+                    <pic:cNvPr id="0" name="01c-run-green.png"/>
+                    <pic:cNvPicPr/>
+                  </pic:nvPicPr>
+                  <pic:blipFill>
+                    <a:blip r:embed="rId11"/>
+                    <a:stretch>
+                      <a:fillRect/>
+                    </a:stretch>
+                  </pic:blipFill>
+                  <pic:spPr>
+                    <a:xfrm>
+                      <a:off x="0" y="0"/>
+                      <a:ext cx="5832000" cy="3331530"/>
+                    </a:xfrm>
+                    <a:prstGeom prst="rect"/>
+                  </pic:spPr>
+                </pic:pic>
+              </a:graphicData>
+            </a:graphic>
+          </wp:inline>
+        </w:drawing>
+      </w:r>
+    </w:p>
+    <w:p>
+      <w:pPr>
+        <w:jc w:val="center"/>
+      </w:pPr>
+      <w:r>
+        <w:rPr>
+          <w:i/>
+          <w:color w:val="595959"/>
+          <w:sz w:val="17"/>
+        </w:rPr>
+        <w:t>a green run — three jobs, all ticks</w:t>
+      </w:r>
+    </w:p>
+    <w:p>
+      <w:r>
+        <w:rPr>
+          <w:rFonts w:ascii="Calibri" w:hAnsi="Calibri"/>
+          <w:b/>
+          <w:sz w:val="21"/>
+        </w:rPr>
+        <w:t>The pipeline then caught a defect in itself.</w:t>
+      </w:r>
       <w:r>
         <w:rPr>
           <w:rFonts w:ascii="Calibri" w:hAnsi="Calibri"/>
           <w:sz w:val="21"/>
         </w:rPr>
-        <w:t xml:space="preserve">Evidence: </w:t>
+        <w:t xml:space="preserve"> The green runs still carried a red</w:t>
+      </w:r>
+    </w:p>
+    <w:p>
+      <w:r>
+        <w:rPr>
+          <w:rFonts w:ascii="Calibri" w:hAnsi="Calibri"/>
+          <w:sz w:val="21"/>
+        </w:rPr>
+        <w:t xml:space="preserve">annotation: </w:t>
       </w:r>
       <w:r>
         <w:rPr>
@@ -3323,31 +3444,56 @@
           <w:color w:val="9C272E"/>
           <w:sz w:val="21"/>
         </w:rPr>
-        <w:t>docs/screenshots/02-ci-green.png</w:t>
+        <w:t>SAST (bandit): Path does not exist: bandit.sarif</w:t>
       </w:r>
       <w:r>
         <w:rPr>
           <w:rFonts w:ascii="Calibri" w:hAnsi="Calibri"/>
           <w:sz w:val="21"/>
         </w:rPr>
-        <w:t xml:space="preserve"> (three jobs green),</w:t>
+        <w:t>. The upload step had</w:t>
       </w:r>
     </w:p>
     <w:p>
+      <w:r>
+        <w:rPr>
+          <w:rFonts w:ascii="Calibri" w:hAnsi="Calibri"/>
+          <w:sz w:val="21"/>
+        </w:rPr>
+        <w:t xml:space="preserve">been failing silently since the first commit, because </w:t>
+      </w:r>
       <w:r>
         <w:rPr>
           <w:rFonts w:ascii="Calibri" w:hAnsi="Calibri" w:eastAsia="Consolas"/>
           <w:color w:val="9C272E"/>
           <w:sz w:val="21"/>
         </w:rPr>
-        <w:t>02b-ci-logs.png</w:t>
+        <w:t>bandit -f sarif</w:t>
       </w:r>
       <w:r>
         <w:rPr>
           <w:rFonts w:ascii="Calibri" w:hAnsi="Calibri"/>
           <w:sz w:val="21"/>
         </w:rPr>
-        <w:t xml:space="preserve"> (the three gates' output), </w:t>
+        <w:t xml:space="preserve"> is an</w:t>
+      </w:r>
+    </w:p>
+    <w:p>
+      <w:r>
+        <w:rPr>
+          <w:rFonts w:ascii="Calibri" w:hAnsi="Calibri"/>
+          <w:sz w:val="21"/>
+        </w:rPr>
+        <w:t>invalid choice on 1.8.0 — the SARIF formatter ships as an optional extra. Fixed by</w:t>
+      </w:r>
+    </w:p>
+    <w:p>
+      <w:r>
+        <w:rPr>
+          <w:rFonts w:ascii="Calibri" w:hAnsi="Calibri"/>
+          <w:sz w:val="21"/>
+        </w:rPr>
+        <w:t xml:space="preserve">installing </w:t>
       </w:r>
       <w:r>
         <w:rPr>
@@ -3355,14 +3501,176 @@
           <w:color w:val="9C272E"/>
           <w:sz w:val="21"/>
         </w:rPr>
-        <w:t>02c-sca-caught.png</w:t>
+        <w:t>bandit[sarif]==1.9.4</w:t>
       </w:r>
       <w:r>
         <w:rPr>
           <w:rFonts w:ascii="Calibri" w:hAnsi="Calibri"/>
           <w:sz w:val="21"/>
         </w:rPr>
-        <w:t xml:space="preserve"> (the rejection).</w:t>
+        <w:t xml:space="preserve"> and adding a check that fails loudly when the</w:t>
+      </w:r>
+    </w:p>
+    <w:p>
+      <w:r>
+        <w:rPr>
+          <w:rFonts w:ascii="Calibri" w:hAnsi="Calibri"/>
+          <w:sz w:val="21"/>
+        </w:rPr>
+        <w:t xml:space="preserve">report is missing, so </w:t>
+      </w:r>
+      <w:r>
+        <w:rPr>
+          <w:rFonts w:ascii="Calibri" w:hAnsi="Calibri" w:eastAsia="Consolas"/>
+          <w:color w:val="9C272E"/>
+          <w:sz w:val="21"/>
+        </w:rPr>
+        <w:t>|| true</w:t>
+      </w:r>
+      <w:r>
+        <w:rPr>
+          <w:rFonts w:ascii="Calibri" w:hAnsi="Calibri"/>
+          <w:sz w:val="21"/>
+        </w:rPr>
+        <w:t xml:space="preserve"> can never hide it again. The analysis now lands in</w:t>
+      </w:r>
+    </w:p>
+    <w:p>
+      <w:r>
+        <w:rPr>
+          <w:rFonts w:ascii="Calibri" w:hAnsi="Calibri"/>
+          <w:b/>
+          <w:sz w:val="21"/>
+        </w:rPr>
+        <w:t>Security → Code scanning</w:t>
+      </w:r>
+      <w:r>
+        <w:rPr>
+          <w:rFonts w:ascii="Calibri" w:hAnsi="Calibri"/>
+          <w:sz w:val="21"/>
+        </w:rPr>
+        <w:t xml:space="preserve"> (tool </w:t>
+      </w:r>
+      <w:r>
+        <w:rPr>
+          <w:rFonts w:ascii="Calibri" w:hAnsi="Calibri" w:eastAsia="Consolas"/>
+          <w:color w:val="9C272E"/>
+          <w:sz w:val="21"/>
+        </w:rPr>
+        <w:t>Bandit</w:t>
+      </w:r>
+      <w:r>
+        <w:rPr>
+          <w:rFonts w:ascii="Calibri" w:hAnsi="Calibri"/>
+          <w:sz w:val="21"/>
+        </w:rPr>
+        <w:t>, 0 results) and the run's remaining</w:t>
+      </w:r>
+    </w:p>
+    <w:p>
+      <w:r>
+        <w:rPr>
+          <w:rFonts w:ascii="Calibri" w:hAnsi="Calibri"/>
+          <w:sz w:val="21"/>
+        </w:rPr>
+        <w:t>annotations are runner-image warnings only.</w:t>
+      </w:r>
+    </w:p>
+    <w:p>
+      <w:r>
+        <w:rPr>
+          <w:rFonts w:ascii="Calibri" w:hAnsi="Calibri"/>
+          <w:sz w:val="21"/>
+        </w:rPr>
+        <w:t xml:space="preserve">Evidence: </w:t>
+      </w:r>
+      <w:r>
+        <w:rPr>
+          <w:rFonts w:ascii="Calibri" w:hAnsi="Calibri" w:eastAsia="Consolas"/>
+          <w:color w:val="9C272E"/>
+          <w:sz w:val="21"/>
+        </w:rPr>
+        <w:t>docs/screenshots/01-ci-history.png</w:t>
+      </w:r>
+      <w:r>
+        <w:rPr>
+          <w:rFonts w:ascii="Calibri" w:hAnsi="Calibri"/>
+          <w:sz w:val="21"/>
+        </w:rPr>
+        <w:t xml:space="preserve"> (the run list),</w:t>
+      </w:r>
+    </w:p>
+    <w:p>
+      <w:r>
+        <w:rPr>
+          <w:rFonts w:ascii="Calibri" w:hAnsi="Calibri" w:eastAsia="Consolas"/>
+          <w:color w:val="9C272E"/>
+          <w:sz w:val="21"/>
+        </w:rPr>
+        <w:t>01b-run1-failed.png</w:t>
+      </w:r>
+      <w:r>
+        <w:rPr>
+          <w:rFonts w:ascii="Calibri" w:hAnsi="Calibri"/>
+          <w:sz w:val="21"/>
+        </w:rPr>
+        <w:t xml:space="preserve"> (SCA rejecting the build), </w:t>
+      </w:r>
+      <w:r>
+        <w:rPr>
+          <w:rFonts w:ascii="Calibri" w:hAnsi="Calibri" w:eastAsia="Consolas"/>
+          <w:color w:val="9C272E"/>
+          <w:sz w:val="21"/>
+        </w:rPr>
+        <w:t>01c-run-green.png</w:t>
+      </w:r>
+      <w:r>
+        <w:rPr>
+          <w:rFonts w:ascii="Calibri" w:hAnsi="Calibri"/>
+          <w:sz w:val="21"/>
+        </w:rPr>
+        <w:t xml:space="preserve"> (three jobs</w:t>
+      </w:r>
+    </w:p>
+    <w:p>
+      <w:r>
+        <w:rPr>
+          <w:rFonts w:ascii="Calibri" w:hAnsi="Calibri"/>
+          <w:sz w:val="21"/>
+        </w:rPr>
+        <w:t xml:space="preserve">green), </w:t>
+      </w:r>
+      <w:r>
+        <w:rPr>
+          <w:rFonts w:ascii="Calibri" w:hAnsi="Calibri" w:eastAsia="Consolas"/>
+          <w:color w:val="9C272E"/>
+          <w:sz w:val="21"/>
+        </w:rPr>
+        <w:t>01d-sarif-error-before-fix.png</w:t>
+      </w:r>
+      <w:r>
+        <w:rPr>
+          <w:rFonts w:ascii="Calibri" w:hAnsi="Calibri"/>
+          <w:sz w:val="21"/>
+        </w:rPr>
+        <w:t xml:space="preserve"> (the annotation above), </w:t>
+      </w:r>
+      <w:r>
+        <w:rPr>
+          <w:rFonts w:ascii="Calibri" w:hAnsi="Calibri" w:eastAsia="Consolas"/>
+          <w:color w:val="9C272E"/>
+          <w:sz w:val="21"/>
+        </w:rPr>
+        <w:t>02b-ci-logs.png</w:t>
+      </w:r>
+    </w:p>
+    <w:p>
+      <w:r>
+        <w:rPr>
+          <w:rFonts w:ascii="Calibri" w:hAnsi="Calibri"/>
+          <w:sz w:val="21"/>
+        </w:rPr>
+        <w:t>(the three gates' output).</w:t>
       </w:r>
     </w:p>
     <w:p>

</xml_diff>